<commit_message>
Remove duplicate plan doc and regenerate it from CURRICULUM.md
The repo tracked two copies of the revised plan: a hand-edited
"... REVISED (1).docx" (the browser's duplicate-download suffix) and a
generated "... REVISED.docx" that predated the edits.

The hand-edited copy carried two real changes — the Goal section and the
front-loading paragraph rewritten in the team's own voice. Those are now in
CURRICULUM.md, which is the source of record, so regenerating no longer
discards them. Word artifacts in that copy (bullet markers flattened to
literal text, broken intra-line spacing) were not carried over.

Co-authored-by: odulsakuc <odulsakuc@hotmail.com>

Claude-Session: https://claude.ai/code/session_01TVi9naDMshbs5D4si8Y38L
</commit_message>
<xml_diff>
--- a/Summer_School_Foundry_Local_Plan_REVISED.docx
+++ b/Summer_School_Foundry_Local_Plan_REVISED.docx
@@ -85,12 +85,12 @@
     </w:p>
     <w:p>
       <w:r>
-        <w:t>Guide beginner computer science students through a full-time, one-month summer program in which they build a local question-answering assistant using Microsoft Foundry Local for offline model inference and the RAG (Retrieval-Augmented Generation) pattern.</w:t>
+        <w:t>As a team, we built a local question-answering assistant using Microsoft Foundry Local for offline model inference and the RAG (Retrieval-Augmented Generation) pattern.</w:t>
       </w:r>
     </w:p>
     <w:p>
       <w:r>
-        <w:t>By the end, each team has a working offline assistant that answers questions about a small document collection by retrieving passages locally and feeding them to an on-device language model. No cloud account. No network call at inference time.</w:t>
+        <w:t>Over the course of a one-month summer program, we developed a fully offline assistant capable of answering questions about a small document collection by retrieving relevant passages locally and feeding them to an on-device language model. The entire system works without a cloud account or any network calls during inference.</w:t>
       </w:r>
     </w:p>
     <w:p>
@@ -1265,7 +1265,7 @@
     </w:p>
     <w:p>
       <w:r>
-        <w:t>The original plan spent two weeks on concepts before students built anything. This version front-loads a working system: students see RAG end to end in week 1 and then learn each component by replacing it.</w:t>
+        <w:t>We decided not to spend the first two weeks focusing only on concepts. Instead, we designed the program around building a working system from the start. In week 1, students experience the full RAG pipeline end to end, and each component is then taught in more detail by having them replace and improve parts of the system themselves.</w:t>
       </w:r>
     </w:p>
     <w:p>

</xml_diff>